<commit_message>
docs(rapports): relecture et corrections du rapport Bloc1 (E1)
Corrections issues d'une vérification systématique de chaque
affirmation contre le code et les données réelles : nombre de sources
(4 -> 3, la revendication BDD retirée), automatisation CoinTelegraph
corrigée (POC manuel, pas automatisé), CryptoDownload scindé en 2
lignes dans le tableau des sources (catalogue API vs téléchargement
CSV), couverture de tests Annexe E corrigée (utils/deps.py manquant,
plage 89-100% -> 77-100%), erreur de numérotation Bloc 2/Bloc 3 ->
Bloc 3/Bloc 4 dans le schéma d'architecture, mention HTTPS retirée du
registre RGPD (aucun TLS/reverse-proxy dans le projet).

Co-Authored-By: Claude Sonnet 5 <noreply@anthropic.com>
</commit_message>
<xml_diff>
--- a/rapports/Rapport_Bloc1_Collecte_Stockage_Donnees.docx
+++ b/rapports/Rapport_Bloc1_Collecte_Stockage_Donnees.docx
@@ -268,7 +268,7 @@
       </w:pPr>
       <w:r>
         <w:rPr/>
-        <w:t>1.1 Objectif du projet et organisation du travail</w:t>
+        <w:t>1.1 Objectif du projet</w:t>
       </w:r>
     </w:p>
     <w:p>
@@ -298,7 +298,7 @@
       </w:pPr>
       <w:r>
         <w:rPr/>
-        <w:t>1.2 Acteurs et organisation du travail</w:t>
+        <w:t>1.2 Organisation du travail</w:t>
       </w:r>
     </w:p>
     <w:p>
@@ -308,7 +308,7 @@
       </w:pPr>
       <w:r>
         <w:rPr/>
-        <w:t>Le projet est réalisé en autonomie dans le cadre d'une certification professionnelle, en suivant une méthodologie agile (sprints itératifs). Le code est versionné sur Git, organisé en modules correspondant aux compétences du bloc (C1 à C5).</w:t>
+        <w:t>Le projet est réalisé en autonomie, sans cérémonie agile formelle (cf. rapport E4 pour la conduite de projet détaillée). Le code est versionné sur Git, organisé en modules correspondant aux compétences du bloc (C1 à C5).</w:t>
       </w:r>
     </w:p>
     <w:p>
@@ -471,7 +471,7 @@
                 <w:szCs w:val="22"/>
                 <w:lang w:val="en-US" w:eastAsia="en-US" w:bidi="ar-SA"/>
               </w:rPr>
-              <w:t>Données OHLCV àhoraire et journalier pour plusieurs paires de trading</w:t>
+              <w:t>Données OHLCV horaire et journalier pour plusieurs paires de trading</w:t>
             </w:r>
           </w:p>
         </w:tc>
@@ -538,7 +538,7 @@
                 <w:szCs w:val="22"/>
                 <w:lang w:val="en-US" w:eastAsia="en-US" w:bidi="ar-SA"/>
               </w:rPr>
-              <w:t>4 sources distinctes : API REST, fichier CSV, scraping web, BDD</w:t>
+              <w:t>3 sources d'extraction externes (API REST, fichier CSV, scraping web) ; PostgreSQL n'est pas une source d'extraction mais la base alimentée par C1-C3, qui sert ensuite de source à l'API (C5) et au modèle ML (Bloc 3).</w:t>
             </w:r>
           </w:p>
         </w:tc>
@@ -1430,7 +1430,7 @@
       </w:pPr>
       <w:r>
         <w:rPr/>
-        <w:t>Conformément aux exigences du référentiel, l'extraction des données est réalisée depuis un mix de sources couvrant les différents types attendus : service web (API REST), fichier de données (CSV), scraping de page web, et base de données.</w:t>
+        <w:t>Conformément aux exigences du référentiel, l'extraction des données est réalisée depuis un mix de sources couvrant les différents types attendus : service web (API REST), fichier de données (CSV), et scraping de page web.</w:t>
       </w:r>
     </w:p>
     <w:p>
@@ -1940,128 +1940,43 @@
         </w:tc>
       </w:tr>
       <w:tr>
-        <w:trPr/>
-        <w:tc>
-          <w:tcPr>
-            <w:tcW w:w="2160" w:type="dxa"/>
-            <w:tcBorders/>
-          </w:tcPr>
-          <w:p>
-            <w:pPr>
-              <w:pStyle w:val="Normal"/>
-              <w:widowControl/>
-              <w:suppressAutoHyphens w:val="true"/>
-              <w:spacing w:before="0" w:after="120"/>
-              <w:jc w:val="left"/>
-              <w:rPr>
-                <w:rFonts w:eastAsia="ＭＳ 明朝" w:cs=""/>
-                <w:kern w:val="0"/>
-                <w:szCs w:val="22"/>
-                <w:lang w:val="en-US" w:eastAsia="en-US" w:bidi="ar-SA"/>
-              </w:rPr>
-            </w:pPr>
-            <w:r>
-              <w:rPr>
-                <w:rFonts w:eastAsia="ＭＳ 明朝" w:cs=""/>
-                <w:kern w:val="0"/>
-                <w:sz w:val="18"/>
-                <w:szCs w:val="22"/>
-                <w:lang w:val="en-US" w:eastAsia="en-US" w:bidi="ar-SA"/>
-              </w:rPr>
-              <w:t>CryptoDownload</w:t>
-            </w:r>
-          </w:p>
-        </w:tc>
-        <w:tc>
-          <w:tcPr>
-            <w:tcW w:w="2160" w:type="dxa"/>
-            <w:tcBorders/>
-          </w:tcPr>
-          <w:p>
-            <w:pPr>
-              <w:pStyle w:val="Normal"/>
-              <w:widowControl/>
-              <w:suppressAutoHyphens w:val="true"/>
-              <w:spacing w:before="0" w:after="120"/>
-              <w:jc w:val="left"/>
-              <w:rPr>
-                <w:rFonts w:eastAsia="ＭＳ 明朝" w:cs=""/>
-                <w:kern w:val="0"/>
-                <w:szCs w:val="22"/>
-                <w:lang w:val="en-US" w:eastAsia="en-US" w:bidi="ar-SA"/>
-              </w:rPr>
-            </w:pPr>
-            <w:r>
-              <w:rPr>
-                <w:rFonts w:eastAsia="ＭＳ 明朝" w:cs=""/>
-                <w:kern w:val="0"/>
-                <w:sz w:val="18"/>
-                <w:szCs w:val="22"/>
-                <w:lang w:val="en-US" w:eastAsia="en-US" w:bidi="ar-SA"/>
-              </w:rPr>
-              <w:t>Fichiers CSV</w:t>
-            </w:r>
-          </w:p>
-        </w:tc>
-        <w:tc>
-          <w:tcPr>
-            <w:tcW w:w="2160" w:type="dxa"/>
-            <w:tcBorders/>
-          </w:tcPr>
-          <w:p>
-            <w:pPr>
-              <w:pStyle w:val="Normal"/>
-              <w:widowControl/>
-              <w:suppressAutoHyphens w:val="true"/>
-              <w:spacing w:before="0" w:after="120"/>
-              <w:jc w:val="left"/>
-              <w:rPr>
-                <w:rFonts w:eastAsia="ＭＳ 明朝" w:cs=""/>
-                <w:kern w:val="0"/>
-                <w:szCs w:val="22"/>
-                <w:lang w:val="en-US" w:eastAsia="en-US" w:bidi="ar-SA"/>
-              </w:rPr>
-            </w:pPr>
-            <w:r>
-              <w:rPr>
-                <w:rFonts w:eastAsia="ＭＳ 明朝" w:cs=""/>
-                <w:kern w:val="0"/>
-                <w:sz w:val="18"/>
-                <w:szCs w:val="22"/>
-                <w:lang w:val="en-US" w:eastAsia="en-US" w:bidi="ar-SA"/>
-              </w:rPr>
-              <w:t>Données historiques OHLCV</w:t>
-            </w:r>
-          </w:p>
-        </w:tc>
-        <w:tc>
-          <w:tcPr>
-            <w:tcW w:w="2159" w:type="dxa"/>
-            <w:tcBorders/>
-          </w:tcPr>
-          <w:p>
-            <w:pPr>
-              <w:pStyle w:val="Normal"/>
-              <w:widowControl/>
-              <w:suppressAutoHyphens w:val="true"/>
-              <w:spacing w:before="0" w:after="120"/>
-              <w:jc w:val="left"/>
-              <w:rPr>
-                <w:rFonts w:eastAsia="ＭＳ 明朝" w:cs=""/>
-                <w:kern w:val="0"/>
-                <w:szCs w:val="22"/>
-                <w:lang w:val="en-US" w:eastAsia="en-US" w:bidi="ar-SA"/>
-              </w:rPr>
-            </w:pPr>
-            <w:r>
-              <w:rPr>
-                <w:rFonts w:eastAsia="ＭＳ 明朝" w:cs=""/>
-                <w:kern w:val="0"/>
-                <w:sz w:val="18"/>
-                <w:szCs w:val="22"/>
-                <w:lang w:val="en-US" w:eastAsia="en-US" w:bidi="ar-SA"/>
-              </w:rPr>
-              <w:t>C1_extraction/extract_csv_data.py</w:t>
+        <w:tc>
+          <w:tcPr>
+            <w:tcW w:type="dxa" w:w="2160"/>
+          </w:tcPr>
+          <w:p>
+            <w:r>
+              <w:t>CryptoDownload (catalogue)</w:t>
+            </w:r>
+          </w:p>
+        </w:tc>
+        <w:tc>
+          <w:tcPr>
+            <w:tcW w:type="dxa" w:w="2160"/>
+          </w:tcPr>
+          <w:p>
+            <w:r>
+              <w:t>API REST (JSON)</w:t>
+            </w:r>
+          </w:p>
+        </w:tc>
+        <w:tc>
+          <w:tcPr>
+            <w:tcW w:type="dxa" w:w="2160"/>
+          </w:tcPr>
+          <w:p>
+            <w:r>
+              <w:t>Liste des paires disponibles</w:t>
+            </w:r>
+          </w:p>
+        </w:tc>
+        <w:tc>
+          <w:tcPr>
+            <w:tcW w:type="dxa" w:w="2159"/>
+          </w:tcPr>
+          <w:p>
+            <w:r>
+              <w:t>C1_extraction/extract_cryptodownload.py</w:t>
             </w:r>
           </w:p>
         </w:tc>
@@ -2096,6 +2011,136 @@
                 <w:szCs w:val="22"/>
                 <w:lang w:val="en-US" w:eastAsia="en-US" w:bidi="ar-SA"/>
               </w:rPr>
+              <w:t>CryptoDownload (historique)</w:t>
+            </w:r>
+          </w:p>
+        </w:tc>
+        <w:tc>
+          <w:tcPr>
+            <w:tcW w:w="2160" w:type="dxa"/>
+            <w:tcBorders/>
+            <w:shd w:fill="D9E2F3" w:val="clear"/>
+          </w:tcPr>
+          <w:p>
+            <w:pPr>
+              <w:pStyle w:val="Normal"/>
+              <w:widowControl/>
+              <w:suppressAutoHyphens w:val="true"/>
+              <w:spacing w:before="0" w:after="120"/>
+              <w:jc w:val="left"/>
+              <w:rPr>
+                <w:rFonts w:eastAsia="ＭＳ 明朝" w:cs=""/>
+                <w:kern w:val="0"/>
+                <w:szCs w:val="22"/>
+                <w:lang w:val="en-US" w:eastAsia="en-US" w:bidi="ar-SA"/>
+              </w:rPr>
+            </w:pPr>
+            <w:r>
+              <w:rPr>
+                <w:rFonts w:eastAsia="ＭＳ 明朝" w:cs=""/>
+                <w:kern w:val="0"/>
+                <w:sz w:val="18"/>
+                <w:szCs w:val="22"/>
+                <w:lang w:val="en-US" w:eastAsia="en-US" w:bidi="ar-SA"/>
+              </w:rPr>
+              <w:t>Fichiers CSV</w:t>
+            </w:r>
+          </w:p>
+        </w:tc>
+        <w:tc>
+          <w:tcPr>
+            <w:tcW w:w="2160" w:type="dxa"/>
+            <w:tcBorders/>
+            <w:shd w:fill="D9E2F3" w:val="clear"/>
+          </w:tcPr>
+          <w:p>
+            <w:pPr>
+              <w:pStyle w:val="Normal"/>
+              <w:widowControl/>
+              <w:suppressAutoHyphens w:val="true"/>
+              <w:spacing w:before="0" w:after="120"/>
+              <w:jc w:val="left"/>
+              <w:rPr>
+                <w:rFonts w:eastAsia="ＭＳ 明朝" w:cs=""/>
+                <w:kern w:val="0"/>
+                <w:szCs w:val="22"/>
+                <w:lang w:val="en-US" w:eastAsia="en-US" w:bidi="ar-SA"/>
+              </w:rPr>
+            </w:pPr>
+            <w:r>
+              <w:rPr>
+                <w:rFonts w:eastAsia="ＭＳ 明朝" w:cs=""/>
+                <w:kern w:val="0"/>
+                <w:sz w:val="18"/>
+                <w:szCs w:val="22"/>
+                <w:lang w:val="en-US" w:eastAsia="en-US" w:bidi="ar-SA"/>
+              </w:rPr>
+              <w:t>Données historiques OHLCV</w:t>
+            </w:r>
+          </w:p>
+        </w:tc>
+        <w:tc>
+          <w:tcPr>
+            <w:tcW w:w="2159" w:type="dxa"/>
+            <w:tcBorders/>
+            <w:shd w:fill="D9E2F3" w:val="clear"/>
+          </w:tcPr>
+          <w:p>
+            <w:pPr>
+              <w:pStyle w:val="Normal"/>
+              <w:widowControl/>
+              <w:suppressAutoHyphens w:val="true"/>
+              <w:spacing w:before="0" w:after="120"/>
+              <w:jc w:val="left"/>
+              <w:rPr>
+                <w:rFonts w:eastAsia="ＭＳ 明朝" w:cs=""/>
+                <w:kern w:val="0"/>
+                <w:szCs w:val="22"/>
+                <w:lang w:val="en-US" w:eastAsia="en-US" w:bidi="ar-SA"/>
+              </w:rPr>
+            </w:pPr>
+            <w:r>
+              <w:rPr>
+                <w:rFonts w:eastAsia="ＭＳ 明朝" w:cs=""/>
+                <w:kern w:val="0"/>
+                <w:sz w:val="18"/>
+                <w:szCs w:val="22"/>
+                <w:lang w:val="en-US" w:eastAsia="en-US" w:bidi="ar-SA"/>
+              </w:rPr>
+              <w:t>C1_extraction/extract_csv_data.py</w:t>
+            </w:r>
+          </w:p>
+        </w:tc>
+      </w:tr>
+      <w:tr>
+        <w:trPr/>
+        <w:tc>
+          <w:tcPr>
+            <w:tcW w:w="2160" w:type="dxa"/>
+            <w:tcBorders/>
+          </w:tcPr>
+          <w:p>
+            <w:pPr>
+              <w:pStyle w:val="Normal"/>
+              <w:widowControl/>
+              <w:suppressAutoHyphens w:val="true"/>
+              <w:spacing w:before="0" w:after="120"/>
+              <w:jc w:val="left"/>
+              <w:rPr>
+                <w:rFonts w:eastAsia="ＭＳ 明朝" w:cs=""/>
+                <w:kern w:val="0"/>
+                <w:szCs w:val="22"/>
+                <w:lang w:val="en-US" w:eastAsia="en-US" w:bidi="ar-SA"/>
+              </w:rPr>
+            </w:pPr>
+            <w:r>
+              <w:rPr>
+                <w:rFonts w:eastAsia="ＭＳ 明朝" w:cs=""/>
+                <w:kern w:val="0"/>
+                <w:sz w:val="18"/>
+                <w:szCs w:val="22"/>
+                <w:lang w:val="en-US" w:eastAsia="en-US" w:bidi="ar-SA"/>
+              </w:rPr>
               <w:t>CoinTelegraph</w:t>
             </w:r>
           </w:p>
@@ -2104,7 +2149,6 @@
           <w:tcPr>
             <w:tcW w:w="2160" w:type="dxa"/>
             <w:tcBorders/>
-            <w:shd w:fill="D9E2F3" w:val="clear"/>
           </w:tcPr>
           <w:p>
             <w:pPr>
@@ -2136,7 +2180,6 @@
           <w:tcPr>
             <w:tcW w:w="2160" w:type="dxa"/>
             <w:tcBorders/>
-            <w:shd w:fill="D9E2F3" w:val="clear"/>
           </w:tcPr>
           <w:p>
             <w:pPr>
@@ -2168,7 +2211,6 @@
           <w:tcPr>
             <w:tcW w:w="2159" w:type="dxa"/>
             <w:tcBorders/>
-            <w:shd w:fill="D9E2F3" w:val="clear"/>
           </w:tcPr>
           <w:p>
             <w:pPr>
@@ -2219,23 +2261,26 @@
       </w:r>
     </w:p>
     <w:p>
-      <w:pPr>
-        <w:pStyle w:val="Heading2"/>
-        <w:rPr/>
-      </w:pPr>
-      <w:r>
-        <w:rPr/>
-        <w:t>2.3 Pérennisation de la collecte</w:t>
+      <w:pPr/>
+      <w:r>
+        <w:t>Le scraping CoinTelegraph n'est pas intégré à l'automatisation du pipeline Bloc1 (pas de tâche cron dédiée) : il est démontré à la demande depuis l'application de veille du Bloc 2 (Bloc2_veille/app_benchmark.py), qui déclenche scrapy crawl cointelegraph via un bouton et affiche les articles récupérés — un choix qui isole la démonstration de la compétence scraping du pipeline de collecte automatisé, qui repose sur les 3 autres sources.</w:t>
       </w:r>
     </w:p>
     <w:p>
       <w:pPr>
-        <w:pStyle w:val="Normal"/>
-        <w:rPr/>
-      </w:pPr>
-      <w:r>
-        <w:rPr/>
-        <w:t>La collecte est automatisée via des tâches cron exécutées dans un conteneur Docker dédié :</w:t>
+        <w:pStyle w:val="Heading2"/>
+      </w:pPr>
+      <w:r>
+        <w:t>2.3 Pérennisation de la collecte OHLCV (Binance)</w:t>
+      </w:r>
+    </w:p>
+    <w:p>
+      <w:pPr>
+        <w:rPr/>
+      </w:pPr>
+      <w:r>
+        <w:rPr/>
+        <w:t>Seule la collecte OHLCV (Binance) est pérennisée par des tâches cron, exécutées dans un conteneur Docker dédié : les catalogues CoinMarketCap/CryptoDownload sont extraits une seule fois, au premier démarrage du conteneur (init_db_and_data.py) ; le scraping CoinTelegraph est déclenché manuellement (cf. ci-dessus).</w:t>
       </w:r>
     </w:p>
     <w:tbl>
@@ -2897,7 +2942,7 @@
       </w:pPr>
       <w:r>
         <w:rPr/>
-        <w:t>Les dates sont normalisées en datetime Python (UTC). Les colonnes sont standardisées : date, open, high, low, close, volume_quote, trading_pair_id. Les entrées corrompues (NaN, valeurs nulles) sont filtrées lors du parsing CSV (pandas). Les doublons sont gérés par les contraintes d'unicité en base de données.</w:t>
+        <w:t>Les dates sont normalisées en datetime Python naïf, représentant un instant UTC par convention plutôt qu'un typage explicite (la colonne date en base est un timestamp without time zone). Les colonnes sont standardisées : date, open, high, low, close, volume_quote, trading_pair_id. Seules les dates non parsables sont filtrées lors du parsing CSV (pandas) ; les valeurs numériques corrompues (NaN) ne sont pas filtrées à ce stade dans Bloc1, mais le sont en aval par le pipeline de features de Bloc3_ml avant toute utilisation par le modèle. Les doublons sont gérés par les contraintes d'unicité en base de données.</w:t>
       </w:r>
     </w:p>
     <w:p>
@@ -4390,6 +4435,12 @@
       <w:r>
         <w:rPr/>
         <w:t>Un token invalide ou absent retourne une erreur 401. Un rôle insuffisant retourne une erreur 403.</w:t>
+      </w:r>
+    </w:p>
+    <w:p>
+      <w:pPr/>
+      <w:r>
+        <w:t>Chemins simplifiés ci-dessus et ci-dessous pour la lisibilité (préfixe /api/v1/authentification, /trading_pairs, /ohlcv ou /predictions omis) — voir l'Annexe C pour le chemin exact de chaque endpoint.</w:t>
       </w:r>
     </w:p>
     <w:p>
@@ -5275,7 +5326,7 @@
       </w:pPr>
       <w:r>
         <w:rPr/>
-        <w:t>La suite de tests (pytest) comprend 51 tests couvrant l'ensemble des endpoints, l'authentification, les contrôles de rôles et les fonctions utilitaires. La couverture des modules API atteint 89 à 100 % selon les fichiers. Les tests utilisent un mock de la base de données (pas de PostgreSQL requis) et un TestClient FastAPI. Les résultats sont présentés en Annexe E.</w:t>
+        <w:t>La suite de tests (pytest) comprend 51 tests couvrant l'ensemble des endpoints, l'authentification, les contrôles de rôles et les fonctions utilitaires. La couverture des modules API atteint 77 à 100 % selon les fichiers (le plus faible étant utils/deps.py, qui gère la session base de données mockée en test). Les tests utilisent un mock de la base de données (pas de PostgreSQL requis) et un TestClient FastAPI. Les résultats sont présentés en Annexe E.</w:t>
       </w:r>
     </w:p>
     <w:p>
@@ -9809,7 +9860,7 @@
           <w:rFonts w:ascii="Consolas" w:hAnsi="Consolas"/>
           <w:sz w:val="20"/>
         </w:rPr>
-        <w:t>Consommateurs : modèle ML (Bloc 2), application web (Bloc 3)</w:t>
+        <w:t>Consommateurs : modèle ML (Bloc 3), application web (Bloc 4)</w:t>
       </w:r>
     </w:p>
     <w:p>
@@ -10316,7 +10367,7 @@
                 <w:szCs w:val="22"/>
                 <w:lang w:val="en-US" w:eastAsia="en-US" w:bidi="ar-SA"/>
               </w:rPr>
-              <w:t>Hashing bcrypt, JWT avec expiration 30 min, HTTPS</w:t>
+              <w:t>Hashing bcrypt, JWT avec expiration 30 min</w:t>
             </w:r>
           </w:p>
         </w:tc>
@@ -12840,6 +12891,36 @@
                 <w:lang w:val="en-US" w:eastAsia="en-US" w:bidi="ar-SA"/>
               </w:rPr>
               <w:t>100 %</w:t>
+            </w:r>
+          </w:p>
+        </w:tc>
+      </w:tr>
+      <w:tr>
+        <w:tc>
+          <w:tcPr>
+            <w:tcW w:type="dxa" w:w="4320"/>
+            <w:shd w:fill="D9E2F3" w:val="clear"/>
+          </w:tcPr>
+          <w:p>
+            <w:r>
+              <w:rPr>
+                <w:sz w:val="18"/>
+              </w:rPr>
+              <w:t>utils/deps.py</w:t>
+            </w:r>
+          </w:p>
+        </w:tc>
+        <w:tc>
+          <w:tcPr>
+            <w:tcW w:type="dxa" w:w="4319"/>
+            <w:shd w:fill="D9E2F3" w:val="clear"/>
+          </w:tcPr>
+          <w:p>
+            <w:r>
+              <w:rPr>
+                <w:sz w:val="18"/>
+              </w:rPr>
+              <w:t>77 %</w:t>
             </w:r>
           </w:p>
         </w:tc>

</xml_diff>

<commit_message>
feat(bloc1): ajoute GET /currencies/all et /exchanges/all (C5)
Referme le seul écart trouvé en relecture E1 : deux des dix tables du
schéma (currencies, exchanges) n'avaient aucune route de lecture, alors
que le critère C5.5 exige que l'API permette de récupérer l'ensemble
des données. Ajoute les deux routes, 3 tests dédiés, et documente la
procédure de suppression du compte API Bloc1 dans le registre RGPD
(absente jusqu'ici, alors que l'Annexe D du rapport E1 la citait).

Co-Authored-By: Claude Sonnet 5 <noreply@anthropic.com>
</commit_message>
<xml_diff>
--- a/rapports/Rapport_Bloc1_Collecte_Stockage_Donnees.docx
+++ b/rapports/Rapport_Bloc1_Collecte_Stockage_Donnees.docx
@@ -683,7 +683,15 @@
       </w:pPr>
       <w:r>
         <w:rPr/>
-        <w:t>1.4 Pile technique</w:t>
+        <w:t xml:space="preserve">1.4 </w:t>
+      </w:r>
+      <w:r>
+        <w:rPr/>
+        <w:t>Stack</w:t>
+      </w:r>
+      <w:r>
+        <w:rPr/>
+        <w:t xml:space="preserve"> technique</w:t>
       </w:r>
     </w:p>
     <w:tbl>
@@ -1311,7 +1319,7 @@
                 <w:szCs w:val="22"/>
                 <w:lang w:val="en-US" w:eastAsia="en-US" w:bidi="ar-SA"/>
               </w:rPr>
-              <w:t>1</w:t>
+              <w:t>4</w:t>
             </w:r>
             <w:r>
               <w:rPr>
@@ -1450,15 +1458,7 @@
       </w:pPr>
       <w:r>
         <w:rPr/>
-        <w:t>L’ensemble du pipeline d’extraction est orchestré par un point d’entrée unique (ini</w:t>
-      </w:r>
-      <w:r>
-        <w:rPr/>
-        <w:t>t</w:t>
-      </w:r>
-      <w:r>
-        <w:rPr/>
-        <w:t>_db_and_data.py). Ce script est exécuté automatiquement au premier démarrage du conteneur data-scripts. (Annexe A)</w:t>
+        <w:t>L’ensemble du pipeline d’extraction est orchestré par un point d’entrée unique (init_db_and_data.py). Ce script est exécuté automatiquement au premier démarrage du conteneur data-scripts. (Annexe A)</w:t>
       </w:r>
     </w:p>
     <w:p>
@@ -1940,42 +1940,95 @@
         </w:tc>
       </w:tr>
       <w:tr>
-        <w:tc>
-          <w:tcPr>
-            <w:tcW w:type="dxa" w:w="2160"/>
-          </w:tcPr>
-          <w:p>
-            <w:r>
+        <w:trPr/>
+        <w:tc>
+          <w:tcPr>
+            <w:tcW w:w="2160" w:type="dxa"/>
+            <w:tcBorders/>
+          </w:tcPr>
+          <w:p>
+            <w:pPr>
+              <w:pStyle w:val="Normal"/>
+              <w:spacing w:before="0" w:after="120"/>
+              <w:rPr>
+                <w:sz w:val="18"/>
+                <w:szCs w:val="18"/>
+              </w:rPr>
+            </w:pPr>
+            <w:r>
+              <w:rPr>
+                <w:sz w:val="18"/>
+                <w:szCs w:val="18"/>
+              </w:rPr>
               <w:t>CryptoDownload (catalogue)</w:t>
             </w:r>
           </w:p>
         </w:tc>
         <w:tc>
           <w:tcPr>
-            <w:tcW w:type="dxa" w:w="2160"/>
-          </w:tcPr>
-          <w:p>
-            <w:r>
+            <w:tcW w:w="2160" w:type="dxa"/>
+            <w:tcBorders/>
+          </w:tcPr>
+          <w:p>
+            <w:pPr>
+              <w:pStyle w:val="Normal"/>
+              <w:spacing w:before="0" w:after="120"/>
+              <w:rPr>
+                <w:sz w:val="18"/>
+                <w:szCs w:val="18"/>
+              </w:rPr>
+            </w:pPr>
+            <w:r>
+              <w:rPr>
+                <w:sz w:val="18"/>
+                <w:szCs w:val="18"/>
+              </w:rPr>
               <w:t>API REST (JSON)</w:t>
             </w:r>
           </w:p>
         </w:tc>
         <w:tc>
           <w:tcPr>
-            <w:tcW w:type="dxa" w:w="2160"/>
-          </w:tcPr>
-          <w:p>
-            <w:r>
+            <w:tcW w:w="2160" w:type="dxa"/>
+            <w:tcBorders/>
+          </w:tcPr>
+          <w:p>
+            <w:pPr>
+              <w:pStyle w:val="Normal"/>
+              <w:spacing w:before="0" w:after="120"/>
+              <w:rPr>
+                <w:sz w:val="18"/>
+                <w:szCs w:val="18"/>
+              </w:rPr>
+            </w:pPr>
+            <w:r>
+              <w:rPr>
+                <w:sz w:val="18"/>
+                <w:szCs w:val="18"/>
+              </w:rPr>
               <w:t>Liste des paires disponibles</w:t>
             </w:r>
           </w:p>
         </w:tc>
         <w:tc>
           <w:tcPr>
-            <w:tcW w:type="dxa" w:w="2159"/>
-          </w:tcPr>
-          <w:p>
-            <w:r>
+            <w:tcW w:w="2159" w:type="dxa"/>
+            <w:tcBorders/>
+          </w:tcPr>
+          <w:p>
+            <w:pPr>
+              <w:pStyle w:val="Normal"/>
+              <w:spacing w:before="0" w:after="120"/>
+              <w:rPr>
+                <w:sz w:val="18"/>
+                <w:szCs w:val="18"/>
+              </w:rPr>
+            </w:pPr>
+            <w:r>
+              <w:rPr>
+                <w:sz w:val="18"/>
+                <w:szCs w:val="18"/>
+              </w:rPr>
               <w:t>C1_extraction/extract_cryptodownload.py</w:t>
             </w:r>
           </w:p>
@@ -2261,21 +2314,28 @@
       </w:r>
     </w:p>
     <w:p>
-      <w:pPr/>
-      <w:r>
+      <w:pPr>
+        <w:pStyle w:val="Normal"/>
+        <w:rPr/>
+      </w:pPr>
+      <w:r>
+        <w:rPr/>
         <w:t>Le scraping CoinTelegraph n'est pas intégré à l'automatisation du pipeline Bloc1 (pas de tâche cron dédiée) : il est démontré à la demande depuis l'application de veille du Bloc 2 (Bloc2_veille/app_benchmark.py), qui déclenche scrapy crawl cointelegraph via un bouton et affiche les articles récupérés — un choix qui isole la démonstration de la compétence scraping du pipeline de collecte automatisé, qui repose sur les 3 autres sources.</w:t>
       </w:r>
     </w:p>
     <w:p>
       <w:pPr>
         <w:pStyle w:val="Heading2"/>
-      </w:pPr>
-      <w:r>
+        <w:rPr/>
+      </w:pPr>
+      <w:r>
+        <w:rPr/>
         <w:t>2.3 Pérennisation de la collecte OHLCV (Binance)</w:t>
       </w:r>
     </w:p>
     <w:p>
       <w:pPr>
+        <w:pStyle w:val="Normal"/>
         <w:rPr/>
       </w:pPr>
       <w:r>
@@ -3029,6 +3089,16 @@
     </w:p>
     <w:p>
       <w:pPr>
+        <w:pStyle w:val="Normal"/>
+        <w:rPr/>
+      </w:pPr>
+      <w:r>
+        <w:rPr/>
+        <w:t>Alternative écartée : une base spécialisée séries temporelles (TimescaleDB, InfluxDB) a été envisagée, les données OHLCV s'y prêtant naturellement. Ce choix a été écarté au regard de la volumétrie modeste du projet (quelques paires de trading, historique borné) qui ne justifie pas l'infrastructure et l'exploitation opérationnelle supplémentaires d'un moteur dédié, et pour garder une stack Docker Compose à un seul service de base de données, cohérente avec le reste du projet (SQLAlchemy, une seule technologie à maintenir).</w:t>
+      </w:r>
+    </w:p>
+    <w:p>
+      <w:pPr>
         <w:pStyle w:val="Heading2"/>
         <w:rPr/>
       </w:pPr>
@@ -4438,8 +4508,12 @@
       </w:r>
     </w:p>
     <w:p>
-      <w:pPr/>
-      <w:r>
+      <w:pPr>
+        <w:pStyle w:val="Normal"/>
+        <w:rPr/>
+      </w:pPr>
+      <w:r>
+        <w:rPr/>
         <w:t>Chemins simplifiés ci-dessus et ci-dessous pour la lisibilité (préfixe /api/v1/authentification, /trading_pairs, /ohlcv ou /predictions omis) — voir l'Annexe C pour le chemin exact de chaque endpoint.</w:t>
       </w:r>
     </w:p>
@@ -4460,15 +4534,7 @@
       </w:pPr>
       <w:r>
         <w:rPr/>
-        <w:t xml:space="preserve">L'API expose 19 endpoints couvrant les 4 opérations CRUD. Le tableau complet est présenté en Annexe </w:t>
-      </w:r>
-      <w:r>
-        <w:rPr/>
-        <w:t>C</w:t>
-      </w:r>
-      <w:r>
-        <w:rPr/>
-        <w:t xml:space="preserve"> :</w:t>
+        <w:t>L'API expose 21 endpoints couvrant les 4 opérations CRUD. Le tableau complet est présenté en Annexe C :</w:t>
       </w:r>
     </w:p>
     <w:tbl>
@@ -5002,18 +5068,16 @@
               <w:spacing w:before="0" w:after="120"/>
               <w:jc w:val="left"/>
               <w:rPr>
-                <w:rFonts w:eastAsia="ＭＳ 明朝" w:cs=""/>
-                <w:kern w:val="0"/>
-                <w:szCs w:val="22"/>
-                <w:lang w:val="en-US" w:eastAsia="en-US" w:bidi="ar-SA"/>
-              </w:rPr>
-            </w:pPr>
-            <w:r>
-              <w:rPr>
-                <w:rFonts w:eastAsia="ＭＳ 明朝" w:cs=""/>
-                <w:kern w:val="0"/>
-                <w:sz w:val="18"/>
-                <w:szCs w:val="22"/>
+                <w:sz w:val="18"/>
+                <w:szCs w:val="18"/>
+              </w:rPr>
+            </w:pPr>
+            <w:r>
+              <w:rPr>
+                <w:rFonts w:eastAsia="ＭＳ 明朝" w:cs=""/>
+                <w:kern w:val="0"/>
+                <w:sz w:val="18"/>
+                <w:szCs w:val="18"/>
                 <w:lang w:val="en-US" w:eastAsia="en-US" w:bidi="ar-SA"/>
               </w:rPr>
               <w:t>Données marché</w:t>
@@ -5028,24 +5092,16 @@
           <w:p>
             <w:pPr>
               <w:pStyle w:val="Normal"/>
-              <w:widowControl/>
-              <w:suppressAutoHyphens w:val="true"/>
-              <w:spacing w:before="0" w:after="120"/>
-              <w:jc w:val="left"/>
-              <w:rPr>
-                <w:rFonts w:eastAsia="ＭＳ 明朝" w:cs=""/>
-                <w:kern w:val="0"/>
-                <w:szCs w:val="22"/>
-                <w:lang w:val="en-US" w:eastAsia="en-US" w:bidi="ar-SA"/>
-              </w:rPr>
-            </w:pPr>
-            <w:r>
-              <w:rPr>
-                <w:rFonts w:eastAsia="ＭＳ 明朝" w:cs=""/>
-                <w:kern w:val="0"/>
-                <w:sz w:val="18"/>
-                <w:szCs w:val="22"/>
-                <w:lang w:val="en-US" w:eastAsia="en-US" w:bidi="ar-SA"/>
+              <w:spacing w:before="0" w:after="120"/>
+              <w:rPr>
+                <w:sz w:val="18"/>
+                <w:szCs w:val="18"/>
+              </w:rPr>
+            </w:pPr>
+            <w:r>
+              <w:rPr>
+                <w:sz w:val="18"/>
+                <w:szCs w:val="18"/>
               </w:rPr>
               <w:t>—</w:t>
             </w:r>
@@ -5059,26 +5115,18 @@
           <w:p>
             <w:pPr>
               <w:pStyle w:val="Normal"/>
-              <w:widowControl/>
-              <w:suppressAutoHyphens w:val="true"/>
-              <w:spacing w:before="0" w:after="120"/>
-              <w:jc w:val="left"/>
-              <w:rPr>
-                <w:rFonts w:eastAsia="ＭＳ 明朝" w:cs=""/>
-                <w:kern w:val="0"/>
-                <w:szCs w:val="22"/>
-                <w:lang w:val="en-US" w:eastAsia="en-US" w:bidi="ar-SA"/>
-              </w:rPr>
-            </w:pPr>
-            <w:r>
-              <w:rPr>
-                <w:rFonts w:eastAsia="ＭＳ 明朝" w:cs=""/>
-                <w:kern w:val="0"/>
-                <w:sz w:val="18"/>
-                <w:szCs w:val="22"/>
-                <w:lang w:val="en-US" w:eastAsia="en-US" w:bidi="ar-SA"/>
-              </w:rPr>
-              <w:t>GET /ohlcv/…, GET /trading_pairs/…</w:t>
+              <w:spacing w:before="0" w:after="120"/>
+              <w:rPr>
+                <w:sz w:val="18"/>
+                <w:szCs w:val="18"/>
+              </w:rPr>
+            </w:pPr>
+            <w:r>
+              <w:rPr>
+                <w:sz w:val="18"/>
+                <w:szCs w:val="18"/>
+              </w:rPr>
+              <w:t>GET /ohlcv/…, GET /trading_pairs/…, GET /currencies/all, GET /exchanges/all</w:t>
             </w:r>
           </w:p>
         </w:tc>
@@ -5090,24 +5138,16 @@
           <w:p>
             <w:pPr>
               <w:pStyle w:val="Normal"/>
-              <w:widowControl/>
-              <w:suppressAutoHyphens w:val="true"/>
-              <w:spacing w:before="0" w:after="120"/>
-              <w:jc w:val="left"/>
-              <w:rPr>
-                <w:rFonts w:eastAsia="ＭＳ 明朝" w:cs=""/>
-                <w:kern w:val="0"/>
-                <w:szCs w:val="22"/>
-                <w:lang w:val="en-US" w:eastAsia="en-US" w:bidi="ar-SA"/>
-              </w:rPr>
-            </w:pPr>
-            <w:r>
-              <w:rPr>
-                <w:rFonts w:eastAsia="ＭＳ 明朝" w:cs=""/>
-                <w:kern w:val="0"/>
-                <w:sz w:val="18"/>
-                <w:szCs w:val="22"/>
-                <w:lang w:val="en-US" w:eastAsia="en-US" w:bidi="ar-SA"/>
+              <w:spacing w:before="0" w:after="120"/>
+              <w:rPr>
+                <w:sz w:val="18"/>
+                <w:szCs w:val="18"/>
+              </w:rPr>
+            </w:pPr>
+            <w:r>
+              <w:rPr>
+                <w:sz w:val="18"/>
+                <w:szCs w:val="18"/>
               </w:rPr>
               <w:t>—</w:t>
             </w:r>
@@ -5121,24 +5161,16 @@
           <w:p>
             <w:pPr>
               <w:pStyle w:val="Normal"/>
-              <w:widowControl/>
-              <w:suppressAutoHyphens w:val="true"/>
-              <w:spacing w:before="0" w:after="120"/>
-              <w:jc w:val="left"/>
-              <w:rPr>
-                <w:rFonts w:eastAsia="ＭＳ 明朝" w:cs=""/>
-                <w:kern w:val="0"/>
-                <w:szCs w:val="22"/>
-                <w:lang w:val="en-US" w:eastAsia="en-US" w:bidi="ar-SA"/>
-              </w:rPr>
-            </w:pPr>
-            <w:r>
-              <w:rPr>
-                <w:rFonts w:eastAsia="ＭＳ 明朝" w:cs=""/>
-                <w:kern w:val="0"/>
-                <w:sz w:val="18"/>
-                <w:szCs w:val="22"/>
-                <w:lang w:val="en-US" w:eastAsia="en-US" w:bidi="ar-SA"/>
+              <w:spacing w:before="0" w:after="120"/>
+              <w:rPr>
+                <w:sz w:val="18"/>
+                <w:szCs w:val="18"/>
+              </w:rPr>
+            </w:pPr>
+            <w:r>
+              <w:rPr>
+                <w:sz w:val="18"/>
+                <w:szCs w:val="18"/>
               </w:rPr>
               <w:t>—</w:t>
             </w:r>
@@ -5161,18 +5193,16 @@
               <w:spacing w:before="0" w:after="120"/>
               <w:jc w:val="left"/>
               <w:rPr>
-                <w:rFonts w:eastAsia="ＭＳ 明朝" w:cs=""/>
-                <w:kern w:val="0"/>
-                <w:szCs w:val="22"/>
-                <w:lang w:val="en-US" w:eastAsia="en-US" w:bidi="ar-SA"/>
-              </w:rPr>
-            </w:pPr>
-            <w:r>
-              <w:rPr>
-                <w:rFonts w:eastAsia="ＭＳ 明朝" w:cs=""/>
-                <w:kern w:val="0"/>
-                <w:sz w:val="18"/>
-                <w:szCs w:val="22"/>
+                <w:sz w:val="18"/>
+                <w:szCs w:val="18"/>
+              </w:rPr>
+            </w:pPr>
+            <w:r>
+              <w:rPr>
+                <w:rFonts w:eastAsia="ＭＳ 明朝" w:cs=""/>
+                <w:kern w:val="0"/>
+                <w:sz w:val="18"/>
+                <w:szCs w:val="18"/>
                 <w:lang w:val="en-US" w:eastAsia="en-US" w:bidi="ar-SA"/>
               </w:rPr>
               <w:t>Monitoring</w:t>
@@ -5193,18 +5223,16 @@
               <w:spacing w:before="0" w:after="120"/>
               <w:jc w:val="left"/>
               <w:rPr>
-                <w:rFonts w:eastAsia="ＭＳ 明朝" w:cs=""/>
-                <w:kern w:val="0"/>
-                <w:szCs w:val="22"/>
-                <w:lang w:val="en-US" w:eastAsia="en-US" w:bidi="ar-SA"/>
-              </w:rPr>
-            </w:pPr>
-            <w:r>
-              <w:rPr>
-                <w:rFonts w:eastAsia="ＭＳ 明朝" w:cs=""/>
-                <w:kern w:val="0"/>
-                <w:sz w:val="18"/>
-                <w:szCs w:val="22"/>
+                <w:sz w:val="18"/>
+                <w:szCs w:val="18"/>
+              </w:rPr>
+            </w:pPr>
+            <w:r>
+              <w:rPr>
+                <w:rFonts w:eastAsia="ＭＳ 明朝" w:cs=""/>
+                <w:kern w:val="0"/>
+                <w:sz w:val="18"/>
+                <w:szCs w:val="18"/>
                 <w:lang w:val="en-US" w:eastAsia="en-US" w:bidi="ar-SA"/>
               </w:rPr>
               <w:t>—</w:t>
@@ -5225,18 +5253,16 @@
               <w:spacing w:before="0" w:after="120"/>
               <w:jc w:val="left"/>
               <w:rPr>
-                <w:rFonts w:eastAsia="ＭＳ 明朝" w:cs=""/>
-                <w:kern w:val="0"/>
-                <w:szCs w:val="22"/>
-                <w:lang w:val="en-US" w:eastAsia="en-US" w:bidi="ar-SA"/>
-              </w:rPr>
-            </w:pPr>
-            <w:r>
-              <w:rPr>
-                <w:rFonts w:eastAsia="ＭＳ 明朝" w:cs=""/>
-                <w:kern w:val="0"/>
-                <w:sz w:val="18"/>
-                <w:szCs w:val="22"/>
+                <w:sz w:val="18"/>
+                <w:szCs w:val="18"/>
+              </w:rPr>
+            </w:pPr>
+            <w:r>
+              <w:rPr>
+                <w:rFonts w:eastAsia="ＭＳ 明朝" w:cs=""/>
+                <w:kern w:val="0"/>
+                <w:sz w:val="18"/>
+                <w:szCs w:val="18"/>
                 <w:lang w:val="en-US" w:eastAsia="en-US" w:bidi="ar-SA"/>
               </w:rPr>
               <w:t>GET /health, GET /metrics</w:t>
@@ -5257,18 +5283,16 @@
               <w:spacing w:before="0" w:after="120"/>
               <w:jc w:val="left"/>
               <w:rPr>
-                <w:rFonts w:eastAsia="ＭＳ 明朝" w:cs=""/>
-                <w:kern w:val="0"/>
-                <w:szCs w:val="22"/>
-                <w:lang w:val="en-US" w:eastAsia="en-US" w:bidi="ar-SA"/>
-              </w:rPr>
-            </w:pPr>
-            <w:r>
-              <w:rPr>
-                <w:rFonts w:eastAsia="ＭＳ 明朝" w:cs=""/>
-                <w:kern w:val="0"/>
-                <w:sz w:val="18"/>
-                <w:szCs w:val="22"/>
+                <w:sz w:val="18"/>
+                <w:szCs w:val="18"/>
+              </w:rPr>
+            </w:pPr>
+            <w:r>
+              <w:rPr>
+                <w:rFonts w:eastAsia="ＭＳ 明朝" w:cs=""/>
+                <w:kern w:val="0"/>
+                <w:sz w:val="18"/>
+                <w:szCs w:val="18"/>
                 <w:lang w:val="en-US" w:eastAsia="en-US" w:bidi="ar-SA"/>
               </w:rPr>
               <w:t>—</w:t>
@@ -5289,18 +5313,16 @@
               <w:spacing w:before="0" w:after="120"/>
               <w:jc w:val="left"/>
               <w:rPr>
-                <w:rFonts w:eastAsia="ＭＳ 明朝" w:cs=""/>
-                <w:kern w:val="0"/>
-                <w:szCs w:val="22"/>
-                <w:lang w:val="en-US" w:eastAsia="en-US" w:bidi="ar-SA"/>
-              </w:rPr>
-            </w:pPr>
-            <w:r>
-              <w:rPr>
-                <w:rFonts w:eastAsia="ＭＳ 明朝" w:cs=""/>
-                <w:kern w:val="0"/>
-                <w:sz w:val="18"/>
-                <w:szCs w:val="22"/>
+                <w:sz w:val="18"/>
+                <w:szCs w:val="18"/>
+              </w:rPr>
+            </w:pPr>
+            <w:r>
+              <w:rPr>
+                <w:rFonts w:eastAsia="ＭＳ 明朝" w:cs=""/>
+                <w:kern w:val="0"/>
+                <w:sz w:val="18"/>
+                <w:szCs w:val="18"/>
                 <w:lang w:val="en-US" w:eastAsia="en-US" w:bidi="ar-SA"/>
               </w:rPr>
               <w:t>—</w:t>
@@ -5311,22 +5333,32 @@
     </w:tbl>
     <w:p>
       <w:pPr>
-        <w:pStyle w:val="Heading2"/>
-        <w:rPr/>
-      </w:pPr>
-      <w:r>
-        <w:rPr/>
-        <w:t>5.4 Tests automatisés</w:t>
+        <w:pStyle w:val="Normal"/>
+        <w:rPr/>
+      </w:pPr>
+      <w:r>
+        <w:rPr/>
+        <w:t>Les tables de référentiel currencies et exchanges sont exposées en lecture (GET /currencies/all, GET /exchanges/all). Les tables de staging ETL cryptocurrency_csv et csv_historical_data (données brutes intermédiaires, cf. C1/C3) restent internes : elles sont déjà consolidées dans ohlcv_hourly et ohlcv_daily, qui constituent le jeu de données exposé aux consommateurs (modèle ML, application web).</w:t>
       </w:r>
     </w:p>
     <w:p>
       <w:pPr>
+        <w:pStyle w:val="Heading2"/>
+        <w:rPr/>
+      </w:pPr>
+      <w:r>
+        <w:rPr/>
+        <w:t>5.4 Tests automatisés</w:t>
+      </w:r>
+    </w:p>
+    <w:p>
+      <w:pPr>
         <w:pStyle w:val="Normal"/>
         <w:rPr/>
       </w:pPr>
       <w:r>
         <w:rPr/>
-        <w:t>La suite de tests (pytest) comprend 51 tests couvrant l'ensemble des endpoints, l'authentification, les contrôles de rôles et les fonctions utilitaires. La couverture des modules API atteint 77 à 100 % selon les fichiers (le plus faible étant utils/deps.py, qui gère la session base de données mockée en test). Les tests utilisent un mock de la base de données (pas de PostgreSQL requis) et un TestClient FastAPI. Les résultats sont présentés en Annexe E.</w:t>
+        <w:t>La suite de tests (pytest) comprend 54 tests couvrant l'ensemble des endpoints, l'authentification, les contrôles de rôles et les fonctions utilitaires. La couverture des modules API atteint 77 à 100 % selon les fichiers (le plus faible étant utils/deps.py, qui gère la session base de données mockée en test). Les tests utilisent un mock de la base de données (pas de PostgreSQL requis) et un TestClient FastAPI. Les résultats sont présentés en Annexe E.</w:t>
       </w:r>
     </w:p>
     <w:p>
@@ -7892,6 +7924,196 @@
           <w:p>
             <w:pPr>
               <w:pStyle w:val="Normal"/>
+              <w:spacing w:before="0" w:after="120"/>
+              <w:rPr>
+                <w:sz w:val="18"/>
+                <w:szCs w:val="18"/>
+              </w:rPr>
+            </w:pPr>
+            <w:r>
+              <w:rPr>
+                <w:sz w:val="18"/>
+                <w:szCs w:val="18"/>
+              </w:rPr>
+              <w:t>GET</w:t>
+            </w:r>
+          </w:p>
+        </w:tc>
+        <w:tc>
+          <w:tcPr>
+            <w:tcW w:w="2160" w:type="dxa"/>
+            <w:tcBorders/>
+          </w:tcPr>
+          <w:p>
+            <w:pPr>
+              <w:pStyle w:val="Normal"/>
+              <w:spacing w:before="0" w:after="120"/>
+              <w:rPr>
+                <w:sz w:val="18"/>
+                <w:szCs w:val="18"/>
+              </w:rPr>
+            </w:pPr>
+            <w:r>
+              <w:rPr>
+                <w:sz w:val="18"/>
+                <w:szCs w:val="18"/>
+              </w:rPr>
+              <w:t>/api/v1/currencies/all</w:t>
+            </w:r>
+          </w:p>
+        </w:tc>
+        <w:tc>
+          <w:tcPr>
+            <w:tcW w:w="2160" w:type="dxa"/>
+            <w:tcBorders/>
+          </w:tcPr>
+          <w:p>
+            <w:pPr>
+              <w:pStyle w:val="Normal"/>
+              <w:spacing w:before="0" w:after="120"/>
+              <w:rPr>
+                <w:sz w:val="18"/>
+                <w:szCs w:val="18"/>
+              </w:rPr>
+            </w:pPr>
+            <w:r>
+              <w:rPr>
+                <w:sz w:val="18"/>
+                <w:szCs w:val="18"/>
+              </w:rPr>
+              <w:t>Liste des cryptomonnaies référencées</w:t>
+            </w:r>
+          </w:p>
+        </w:tc>
+        <w:tc>
+          <w:tcPr>
+            <w:tcW w:w="2159" w:type="dxa"/>
+            <w:tcBorders/>
+          </w:tcPr>
+          <w:p>
+            <w:pPr>
+              <w:pStyle w:val="Normal"/>
+              <w:spacing w:before="0" w:after="120"/>
+              <w:rPr>
+                <w:sz w:val="18"/>
+                <w:szCs w:val="18"/>
+              </w:rPr>
+            </w:pPr>
+            <w:r>
+              <w:rPr>
+                <w:sz w:val="18"/>
+                <w:szCs w:val="18"/>
+              </w:rPr>
+              <w:t>JWT</w:t>
+            </w:r>
+          </w:p>
+        </w:tc>
+      </w:tr>
+      <w:tr>
+        <w:trPr/>
+        <w:tc>
+          <w:tcPr>
+            <w:tcW w:w="2160" w:type="dxa"/>
+            <w:tcBorders/>
+          </w:tcPr>
+          <w:p>
+            <w:pPr>
+              <w:pStyle w:val="Normal"/>
+              <w:spacing w:before="0" w:after="120"/>
+              <w:rPr>
+                <w:sz w:val="18"/>
+                <w:szCs w:val="18"/>
+              </w:rPr>
+            </w:pPr>
+            <w:r>
+              <w:rPr>
+                <w:sz w:val="18"/>
+                <w:szCs w:val="18"/>
+              </w:rPr>
+              <w:t>GET</w:t>
+            </w:r>
+          </w:p>
+        </w:tc>
+        <w:tc>
+          <w:tcPr>
+            <w:tcW w:w="2160" w:type="dxa"/>
+            <w:tcBorders/>
+          </w:tcPr>
+          <w:p>
+            <w:pPr>
+              <w:pStyle w:val="Normal"/>
+              <w:spacing w:before="0" w:after="120"/>
+              <w:rPr>
+                <w:sz w:val="18"/>
+                <w:szCs w:val="18"/>
+              </w:rPr>
+            </w:pPr>
+            <w:r>
+              <w:rPr>
+                <w:sz w:val="18"/>
+                <w:szCs w:val="18"/>
+              </w:rPr>
+              <w:t>/api/v1/exchanges/all</w:t>
+            </w:r>
+          </w:p>
+        </w:tc>
+        <w:tc>
+          <w:tcPr>
+            <w:tcW w:w="2160" w:type="dxa"/>
+            <w:tcBorders/>
+          </w:tcPr>
+          <w:p>
+            <w:pPr>
+              <w:pStyle w:val="Normal"/>
+              <w:spacing w:before="0" w:after="120"/>
+              <w:rPr>
+                <w:sz w:val="18"/>
+                <w:szCs w:val="18"/>
+              </w:rPr>
+            </w:pPr>
+            <w:r>
+              <w:rPr>
+                <w:sz w:val="18"/>
+                <w:szCs w:val="18"/>
+              </w:rPr>
+              <w:t>Liste des places de marché référencées</w:t>
+            </w:r>
+          </w:p>
+        </w:tc>
+        <w:tc>
+          <w:tcPr>
+            <w:tcW w:w="2159" w:type="dxa"/>
+            <w:tcBorders/>
+          </w:tcPr>
+          <w:p>
+            <w:pPr>
+              <w:pStyle w:val="Normal"/>
+              <w:spacing w:before="0" w:after="120"/>
+              <w:rPr>
+                <w:sz w:val="18"/>
+                <w:szCs w:val="18"/>
+              </w:rPr>
+            </w:pPr>
+            <w:r>
+              <w:rPr>
+                <w:sz w:val="18"/>
+                <w:szCs w:val="18"/>
+              </w:rPr>
+              <w:t>JWT</w:t>
+            </w:r>
+          </w:p>
+        </w:tc>
+      </w:tr>
+      <w:tr>
+        <w:trPr/>
+        <w:tc>
+          <w:tcPr>
+            <w:tcW w:w="2160" w:type="dxa"/>
+            <w:tcBorders/>
+          </w:tcPr>
+          <w:p>
+            <w:pPr>
+              <w:pStyle w:val="Normal"/>
               <w:widowControl/>
               <w:suppressAutoHyphens w:val="true"/>
               <w:spacing w:before="0" w:after="120"/>
@@ -10584,27 +10806,45 @@
       </w:pPr>
       <w:r>
         <w:rPr/>
-        <w:t>Procédures de tri : l'endpoint DELETE /api/v1/authentification/account permet à chaque utilisateur d'exercer son droit à l'effacement. Les données de marché étant publiques et anonymes, aucune procédure de tri supplémentaire n'est requise.</w:t>
+        <w:t>Procédures de tri : deux procédures de suppression distinctes selon le système. Compte API Bloc1 (ce rapport) : libre-service, immédia</w:t>
+      </w:r>
+      <w:r>
+        <w:rPr/>
+        <w:t>t</w:t>
+      </w:r>
+      <w:r>
+        <w:rPr/>
+        <w:t>, l'endpoint DELETE /api/v1/authentification/account permet à chaque utilisateur authentifié de supprimer son compte sans intervention d'un administrateur. Compte application Django (Bloc 4) : procédure manuelle par l'administrateur, délai de 30 jours maximum. Les données de marché étant publiques et anonymes, aucune procédure de tri supplémentaire n'est requise pour ces données.</w:t>
       </w:r>
     </w:p>
     <w:p>
       <w:pPr>
-        <w:pStyle w:val="Heading2"/>
-        <w:rPr/>
-      </w:pPr>
-      <w:r>
-        <w:rPr/>
-        <w:t>Annexe E — Résultats des tests</w:t>
+        <w:pStyle w:val="Normal"/>
+        <w:rPr/>
+      </w:pPr>
+      <w:r>
+        <w:rPr/>
+        <w:t>Fréquence des contrôles de conformité : revue des accès trimestrielle, vérification des durées de conservation semestrielle, audit des mesures de sécurité annuel, mise à jour du registre à chaque modification du système (détail complet : docs/rgpd_registre_traitements.md, section 3.6).</w:t>
       </w:r>
     </w:p>
     <w:p>
       <w:pPr>
+        <w:pStyle w:val="Heading2"/>
+        <w:rPr/>
+      </w:pPr>
+      <w:r>
+        <w:rPr/>
+        <w:t>Annexe E — Résultats des tests</w:t>
+      </w:r>
+    </w:p>
+    <w:p>
+      <w:pPr>
         <w:pStyle w:val="Normal"/>
         <w:rPr/>
       </w:pPr>
       <w:r>
         <w:rPr/>
-        <w:t>Résultats de l'exécution : 51 tests passés avec succès (0 échec).</w:t>
+        <w:t>Résultats de l'exécution : 54 tests passés avec succès (0 échec).</w:t>
       </w:r>
     </w:p>
     <w:p>
@@ -12324,6 +12564,101 @@
           </w:p>
         </w:tc>
       </w:tr>
+      <w:tr>
+        <w:trPr/>
+        <w:tc>
+          <w:tcPr>
+            <w:tcW w:w="2160" w:type="dxa"/>
+            <w:tcBorders/>
+          </w:tcPr>
+          <w:p>
+            <w:pPr>
+              <w:pStyle w:val="Normal"/>
+              <w:spacing w:before="0" w:after="120"/>
+              <w:rPr>
+                <w:sz w:val="18"/>
+                <w:szCs w:val="18"/>
+              </w:rPr>
+            </w:pPr>
+            <w:r>
+              <w:rPr>
+                <w:sz w:val="18"/>
+                <w:szCs w:val="18"/>
+              </w:rPr>
+              <w:t>test_api_endpoints.py</w:t>
+            </w:r>
+          </w:p>
+        </w:tc>
+        <w:tc>
+          <w:tcPr>
+            <w:tcW w:w="2160" w:type="dxa"/>
+            <w:tcBorders/>
+          </w:tcPr>
+          <w:p>
+            <w:pPr>
+              <w:pStyle w:val="Normal"/>
+              <w:spacing w:before="0" w:after="120"/>
+              <w:rPr>
+                <w:sz w:val="18"/>
+                <w:szCs w:val="18"/>
+              </w:rPr>
+            </w:pPr>
+            <w:r>
+              <w:rPr>
+                <w:sz w:val="18"/>
+                <w:szCs w:val="18"/>
+              </w:rPr>
+              <w:t>TestReferenceData</w:t>
+            </w:r>
+          </w:p>
+        </w:tc>
+        <w:tc>
+          <w:tcPr>
+            <w:tcW w:w="2160" w:type="dxa"/>
+            <w:tcBorders/>
+          </w:tcPr>
+          <w:p>
+            <w:pPr>
+              <w:pStyle w:val="Normal"/>
+              <w:spacing w:before="0" w:after="120"/>
+              <w:rPr>
+                <w:sz w:val="18"/>
+                <w:szCs w:val="18"/>
+              </w:rPr>
+            </w:pPr>
+            <w:r>
+              <w:rPr>
+                <w:sz w:val="18"/>
+                <w:szCs w:val="18"/>
+              </w:rPr>
+              <w:t>3</w:t>
+            </w:r>
+          </w:p>
+        </w:tc>
+        <w:tc>
+          <w:tcPr>
+            <w:tcW w:w="2159" w:type="dxa"/>
+            <w:tcBorders/>
+          </w:tcPr>
+          <w:p>
+            <w:pPr>
+              <w:pStyle w:val="Normal"/>
+              <w:spacing w:before="0" w:after="120"/>
+              <w:rPr>
+                <w:sz w:val="18"/>
+                <w:szCs w:val="18"/>
+              </w:rPr>
+            </w:pPr>
+            <w:r>
+              <w:rPr>
+                <w:sz w:val="18"/>
+                <w:szCs w:val="18"/>
+              </w:rPr>
+              <w:t>PASSED</w:t>
+            </w:r>
+          </w:p>
+        </w:tc>
+      </w:tr>
     </w:tbl>
     <w:p>
       <w:pPr>
@@ -12576,26 +12911,18 @@
           <w:p>
             <w:pPr>
               <w:pStyle w:val="Normal"/>
-              <w:widowControl/>
-              <w:suppressAutoHyphens w:val="true"/>
-              <w:spacing w:before="0" w:after="120"/>
-              <w:jc w:val="left"/>
-              <w:rPr>
-                <w:rFonts w:eastAsia="ＭＳ 明朝" w:cs=""/>
-                <w:kern w:val="0"/>
-                <w:szCs w:val="22"/>
-                <w:lang w:val="en-US" w:eastAsia="en-US" w:bidi="ar-SA"/>
-              </w:rPr>
-            </w:pPr>
-            <w:r>
-              <w:rPr>
-                <w:rFonts w:eastAsia="ＭＳ 明朝" w:cs=""/>
-                <w:kern w:val="0"/>
-                <w:sz w:val="18"/>
-                <w:szCs w:val="22"/>
-                <w:lang w:val="en-US" w:eastAsia="en-US" w:bidi="ar-SA"/>
-              </w:rPr>
-              <w:t>routes/ohlcv.py</w:t>
+              <w:spacing w:before="0" w:after="120"/>
+              <w:rPr>
+                <w:sz w:val="18"/>
+                <w:szCs w:val="18"/>
+              </w:rPr>
+            </w:pPr>
+            <w:r>
+              <w:rPr>
+                <w:sz w:val="18"/>
+                <w:szCs w:val="18"/>
+              </w:rPr>
+              <w:t>routes/currencies.py</w:t>
             </w:r>
           </w:p>
         </w:tc>
@@ -12607,26 +12934,18 @@
           <w:p>
             <w:pPr>
               <w:pStyle w:val="Normal"/>
-              <w:widowControl/>
-              <w:suppressAutoHyphens w:val="true"/>
-              <w:spacing w:before="0" w:after="120"/>
-              <w:jc w:val="left"/>
-              <w:rPr>
-                <w:rFonts w:eastAsia="ＭＳ 明朝" w:cs=""/>
-                <w:kern w:val="0"/>
-                <w:szCs w:val="22"/>
-                <w:lang w:val="en-US" w:eastAsia="en-US" w:bidi="ar-SA"/>
-              </w:rPr>
-            </w:pPr>
-            <w:r>
-              <w:rPr>
-                <w:rFonts w:eastAsia="ＭＳ 明朝" w:cs=""/>
-                <w:kern w:val="0"/>
-                <w:sz w:val="18"/>
-                <w:szCs w:val="22"/>
-                <w:lang w:val="en-US" w:eastAsia="en-US" w:bidi="ar-SA"/>
-              </w:rPr>
-              <w:t>92 %</w:t>
+              <w:spacing w:before="0" w:after="120"/>
+              <w:rPr>
+                <w:sz w:val="18"/>
+                <w:szCs w:val="18"/>
+              </w:rPr>
+            </w:pPr>
+            <w:r>
+              <w:rPr>
+                <w:sz w:val="18"/>
+                <w:szCs w:val="18"/>
+              </w:rPr>
+              <w:t>100 %</w:t>
             </w:r>
           </w:p>
         </w:tc>
@@ -12637,31 +12956,22 @@
           <w:tcPr>
             <w:tcW w:w="4320" w:type="dxa"/>
             <w:tcBorders/>
-            <w:shd w:fill="D9E2F3" w:val="clear"/>
-          </w:tcPr>
-          <w:p>
-            <w:pPr>
-              <w:pStyle w:val="Normal"/>
-              <w:widowControl/>
-              <w:suppressAutoHyphens w:val="true"/>
-              <w:spacing w:before="0" w:after="120"/>
-              <w:jc w:val="left"/>
-              <w:rPr>
-                <w:rFonts w:eastAsia="ＭＳ 明朝" w:cs=""/>
-                <w:kern w:val="0"/>
-                <w:szCs w:val="22"/>
-                <w:lang w:val="en-US" w:eastAsia="en-US" w:bidi="ar-SA"/>
-              </w:rPr>
-            </w:pPr>
-            <w:r>
-              <w:rPr>
-                <w:rFonts w:eastAsia="ＭＳ 明朝" w:cs=""/>
-                <w:kern w:val="0"/>
-                <w:sz w:val="18"/>
-                <w:szCs w:val="22"/>
-                <w:lang w:val="en-US" w:eastAsia="en-US" w:bidi="ar-SA"/>
-              </w:rPr>
-              <w:t>routes/predictions.py</w:t>
+          </w:tcPr>
+          <w:p>
+            <w:pPr>
+              <w:pStyle w:val="Normal"/>
+              <w:spacing w:before="0" w:after="120"/>
+              <w:rPr>
+                <w:sz w:val="18"/>
+                <w:szCs w:val="18"/>
+              </w:rPr>
+            </w:pPr>
+            <w:r>
+              <w:rPr>
+                <w:sz w:val="18"/>
+                <w:szCs w:val="18"/>
+              </w:rPr>
+              <w:t>routes/exchanges.py</w:t>
             </w:r>
           </w:p>
         </w:tc>
@@ -12669,31 +12979,22 @@
           <w:tcPr>
             <w:tcW w:w="4319" w:type="dxa"/>
             <w:tcBorders/>
-            <w:shd w:fill="D9E2F3" w:val="clear"/>
-          </w:tcPr>
-          <w:p>
-            <w:pPr>
-              <w:pStyle w:val="Normal"/>
-              <w:widowControl/>
-              <w:suppressAutoHyphens w:val="true"/>
-              <w:spacing w:before="0" w:after="120"/>
-              <w:jc w:val="left"/>
-              <w:rPr>
-                <w:rFonts w:eastAsia="ＭＳ 明朝" w:cs=""/>
-                <w:kern w:val="0"/>
-                <w:szCs w:val="22"/>
-                <w:lang w:val="en-US" w:eastAsia="en-US" w:bidi="ar-SA"/>
-              </w:rPr>
-            </w:pPr>
-            <w:r>
-              <w:rPr>
-                <w:rFonts w:eastAsia="ＭＳ 明朝" w:cs=""/>
-                <w:kern w:val="0"/>
-                <w:sz w:val="18"/>
-                <w:szCs w:val="22"/>
-                <w:lang w:val="en-US" w:eastAsia="en-US" w:bidi="ar-SA"/>
-              </w:rPr>
-              <w:t>89 %</w:t>
+          </w:tcPr>
+          <w:p>
+            <w:pPr>
+              <w:pStyle w:val="Normal"/>
+              <w:spacing w:before="0" w:after="120"/>
+              <w:rPr>
+                <w:sz w:val="18"/>
+                <w:szCs w:val="18"/>
+              </w:rPr>
+            </w:pPr>
+            <w:r>
+              <w:rPr>
+                <w:sz w:val="18"/>
+                <w:szCs w:val="18"/>
+              </w:rPr>
+              <w:t>100 %</w:t>
             </w:r>
           </w:p>
         </w:tc>
@@ -12713,21 +13014,19 @@
               <w:spacing w:before="0" w:after="120"/>
               <w:jc w:val="left"/>
               <w:rPr>
-                <w:rFonts w:eastAsia="ＭＳ 明朝" w:cs=""/>
-                <w:kern w:val="0"/>
-                <w:szCs w:val="22"/>
-                <w:lang w:val="en-US" w:eastAsia="en-US" w:bidi="ar-SA"/>
-              </w:rPr>
-            </w:pPr>
-            <w:r>
-              <w:rPr>
-                <w:rFonts w:eastAsia="ＭＳ 明朝" w:cs=""/>
-                <w:kern w:val="0"/>
-                <w:sz w:val="18"/>
-                <w:szCs w:val="22"/>
-                <w:lang w:val="en-US" w:eastAsia="en-US" w:bidi="ar-SA"/>
-              </w:rPr>
-              <w:t>utils/auth.py</w:t>
+                <w:sz w:val="18"/>
+                <w:szCs w:val="18"/>
+              </w:rPr>
+            </w:pPr>
+            <w:r>
+              <w:rPr>
+                <w:rFonts w:eastAsia="ＭＳ 明朝" w:cs=""/>
+                <w:kern w:val="0"/>
+                <w:sz w:val="18"/>
+                <w:szCs w:val="18"/>
+                <w:lang w:val="en-US" w:eastAsia="en-US" w:bidi="ar-SA"/>
+              </w:rPr>
+              <w:t>routes/ohlcv.py</w:t>
             </w:r>
           </w:p>
         </w:tc>
@@ -12739,26 +13038,18 @@
           <w:p>
             <w:pPr>
               <w:pStyle w:val="Normal"/>
-              <w:widowControl/>
-              <w:suppressAutoHyphens w:val="true"/>
-              <w:spacing w:before="0" w:after="120"/>
-              <w:jc w:val="left"/>
-              <w:rPr>
-                <w:rFonts w:eastAsia="ＭＳ 明朝" w:cs=""/>
-                <w:kern w:val="0"/>
-                <w:szCs w:val="22"/>
-                <w:lang w:val="en-US" w:eastAsia="en-US" w:bidi="ar-SA"/>
-              </w:rPr>
-            </w:pPr>
-            <w:r>
-              <w:rPr>
-                <w:rFonts w:eastAsia="ＭＳ 明朝" w:cs=""/>
-                <w:kern w:val="0"/>
-                <w:sz w:val="18"/>
-                <w:szCs w:val="22"/>
-                <w:lang w:val="en-US" w:eastAsia="en-US" w:bidi="ar-SA"/>
-              </w:rPr>
-              <w:t>95 %</w:t>
+              <w:spacing w:before="0" w:after="120"/>
+              <w:rPr>
+                <w:sz w:val="18"/>
+                <w:szCs w:val="18"/>
+              </w:rPr>
+            </w:pPr>
+            <w:r>
+              <w:rPr>
+                <w:sz w:val="18"/>
+                <w:szCs w:val="18"/>
+              </w:rPr>
+              <w:t>90 %</w:t>
             </w:r>
           </w:p>
         </w:tc>
@@ -12793,7 +13084,7 @@
                 <w:szCs w:val="22"/>
                 <w:lang w:val="en-US" w:eastAsia="en-US" w:bidi="ar-SA"/>
               </w:rPr>
-              <w:t>utils/classes.py</w:t>
+              <w:t>routes/predictions.py</w:t>
             </w:r>
           </w:p>
         </w:tc>
@@ -12825,7 +13116,7 @@
                 <w:szCs w:val="22"/>
                 <w:lang w:val="en-US" w:eastAsia="en-US" w:bidi="ar-SA"/>
               </w:rPr>
-              <w:t>100 %</w:t>
+              <w:t>89 %</w:t>
             </w:r>
           </w:p>
         </w:tc>
@@ -12859,7 +13150,7 @@
                 <w:szCs w:val="22"/>
                 <w:lang w:val="en-US" w:eastAsia="en-US" w:bidi="ar-SA"/>
               </w:rPr>
-              <w:t>utils/functions.py</w:t>
+              <w:t>utils/auth.py</w:t>
             </w:r>
           </w:p>
         </w:tc>
@@ -12890,18 +13181,161 @@
                 <w:szCs w:val="22"/>
                 <w:lang w:val="en-US" w:eastAsia="en-US" w:bidi="ar-SA"/>
               </w:rPr>
-              <w:t>100 %</w:t>
+              <w:t>95 %</w:t>
             </w:r>
           </w:p>
         </w:tc>
       </w:tr>
       <w:tr>
-        <w:tc>
-          <w:tcPr>
-            <w:tcW w:type="dxa" w:w="4320"/>
+        <w:trPr/>
+        <w:tc>
+          <w:tcPr>
+            <w:tcW w:w="4320" w:type="dxa"/>
+            <w:tcBorders/>
             <w:shd w:fill="D9E2F3" w:val="clear"/>
           </w:tcPr>
           <w:p>
+            <w:pPr>
+              <w:pStyle w:val="Normal"/>
+              <w:widowControl/>
+              <w:suppressAutoHyphens w:val="true"/>
+              <w:spacing w:before="0" w:after="120"/>
+              <w:jc w:val="left"/>
+              <w:rPr>
+                <w:rFonts w:eastAsia="ＭＳ 明朝" w:cs=""/>
+                <w:kern w:val="0"/>
+                <w:szCs w:val="22"/>
+                <w:lang w:val="en-US" w:eastAsia="en-US" w:bidi="ar-SA"/>
+              </w:rPr>
+            </w:pPr>
+            <w:r>
+              <w:rPr>
+                <w:rFonts w:eastAsia="ＭＳ 明朝" w:cs=""/>
+                <w:kern w:val="0"/>
+                <w:sz w:val="18"/>
+                <w:szCs w:val="22"/>
+                <w:lang w:val="en-US" w:eastAsia="en-US" w:bidi="ar-SA"/>
+              </w:rPr>
+              <w:t>utils/classes.py</w:t>
+            </w:r>
+          </w:p>
+        </w:tc>
+        <w:tc>
+          <w:tcPr>
+            <w:tcW w:w="4319" w:type="dxa"/>
+            <w:tcBorders/>
+            <w:shd w:fill="D9E2F3" w:val="clear"/>
+          </w:tcPr>
+          <w:p>
+            <w:pPr>
+              <w:pStyle w:val="Normal"/>
+              <w:widowControl/>
+              <w:suppressAutoHyphens w:val="true"/>
+              <w:spacing w:before="0" w:after="120"/>
+              <w:jc w:val="left"/>
+              <w:rPr>
+                <w:rFonts w:eastAsia="ＭＳ 明朝" w:cs=""/>
+                <w:kern w:val="0"/>
+                <w:szCs w:val="22"/>
+                <w:lang w:val="en-US" w:eastAsia="en-US" w:bidi="ar-SA"/>
+              </w:rPr>
+            </w:pPr>
+            <w:r>
+              <w:rPr>
+                <w:rFonts w:eastAsia="ＭＳ 明朝" w:cs=""/>
+                <w:kern w:val="0"/>
+                <w:sz w:val="18"/>
+                <w:szCs w:val="22"/>
+                <w:lang w:val="en-US" w:eastAsia="en-US" w:bidi="ar-SA"/>
+              </w:rPr>
+              <w:t>100 %</w:t>
+            </w:r>
+          </w:p>
+        </w:tc>
+      </w:tr>
+      <w:tr>
+        <w:trPr/>
+        <w:tc>
+          <w:tcPr>
+            <w:tcW w:w="4320" w:type="dxa"/>
+            <w:tcBorders/>
+          </w:tcPr>
+          <w:p>
+            <w:pPr>
+              <w:pStyle w:val="Normal"/>
+              <w:widowControl/>
+              <w:suppressAutoHyphens w:val="true"/>
+              <w:spacing w:before="0" w:after="120"/>
+              <w:jc w:val="left"/>
+              <w:rPr>
+                <w:rFonts w:eastAsia="ＭＳ 明朝" w:cs=""/>
+                <w:kern w:val="0"/>
+                <w:szCs w:val="22"/>
+                <w:lang w:val="en-US" w:eastAsia="en-US" w:bidi="ar-SA"/>
+              </w:rPr>
+            </w:pPr>
+            <w:r>
+              <w:rPr>
+                <w:rFonts w:eastAsia="ＭＳ 明朝" w:cs=""/>
+                <w:kern w:val="0"/>
+                <w:sz w:val="18"/>
+                <w:szCs w:val="22"/>
+                <w:lang w:val="en-US" w:eastAsia="en-US" w:bidi="ar-SA"/>
+              </w:rPr>
+              <w:t>utils/functions.py</w:t>
+            </w:r>
+          </w:p>
+        </w:tc>
+        <w:tc>
+          <w:tcPr>
+            <w:tcW w:w="4319" w:type="dxa"/>
+            <w:tcBorders/>
+          </w:tcPr>
+          <w:p>
+            <w:pPr>
+              <w:pStyle w:val="Normal"/>
+              <w:widowControl/>
+              <w:suppressAutoHyphens w:val="true"/>
+              <w:spacing w:before="0" w:after="120"/>
+              <w:jc w:val="left"/>
+              <w:rPr>
+                <w:rFonts w:eastAsia="ＭＳ 明朝" w:cs=""/>
+                <w:kern w:val="0"/>
+                <w:szCs w:val="22"/>
+                <w:lang w:val="en-US" w:eastAsia="en-US" w:bidi="ar-SA"/>
+              </w:rPr>
+            </w:pPr>
+            <w:r>
+              <w:rPr>
+                <w:rFonts w:eastAsia="ＭＳ 明朝" w:cs=""/>
+                <w:kern w:val="0"/>
+                <w:sz w:val="18"/>
+                <w:szCs w:val="22"/>
+                <w:lang w:val="en-US" w:eastAsia="en-US" w:bidi="ar-SA"/>
+              </w:rPr>
+              <w:t>100 %</w:t>
+            </w:r>
+          </w:p>
+        </w:tc>
+      </w:tr>
+      <w:tr>
+        <w:trPr/>
+        <w:tc>
+          <w:tcPr>
+            <w:tcW w:w="4320" w:type="dxa"/>
+            <w:tcBorders/>
+            <w:shd w:fill="D9E2F3" w:val="clear"/>
+          </w:tcPr>
+          <w:p>
+            <w:pPr>
+              <w:pStyle w:val="Normal"/>
+              <w:widowControl/>
+              <w:suppressAutoHyphens w:val="true"/>
+              <w:bidi w:val="0"/>
+              <w:spacing w:lineRule="auto" w:line="276" w:before="0" w:after="120"/>
+              <w:jc w:val="left"/>
+              <w:rPr/>
+            </w:pPr>
             <w:r>
               <w:rPr>
                 <w:sz w:val="18"/>
@@ -12912,10 +13346,20 @@
         </w:tc>
         <w:tc>
           <w:tcPr>
-            <w:tcW w:type="dxa" w:w="4319"/>
+            <w:tcW w:w="4319" w:type="dxa"/>
+            <w:tcBorders/>
             <w:shd w:fill="D9E2F3" w:val="clear"/>
           </w:tcPr>
           <w:p>
+            <w:pPr>
+              <w:pStyle w:val="Normal"/>
+              <w:widowControl/>
+              <w:suppressAutoHyphens w:val="true"/>
+              <w:bidi w:val="0"/>
+              <w:spacing w:lineRule="auto" w:line="276" w:before="0" w:after="120"/>
+              <w:jc w:val="left"/>
+              <w:rPr/>
+            </w:pPr>
             <w:r>
               <w:rPr>
                 <w:sz w:val="18"/>

</xml_diff>